<commit_message>
Unslop resume wording: drop dash-as-punctuation and filler phrasing
Removed em/en dashes used as sentence interrupters and header
separators (replaced with commas), rewrote the "grounded in" and
"drive continuous improvement" mannered phrasing, and split a
run-on summary sentence. Regenerated the docx/pdf from the cleaned
markdown so all three formats stay in sync.

Co-Authored-By: Claude Sonnet 5 <noreply@anthropic.com>
Claude-Session: https://claude.ai/code/session_01HvzpZWt1KfeTxdgbzsHSvq
</commit_message>
<xml_diff>
--- a/applications/KanadeviaInova_ProductMarketingManager/Dorian_Moyne_KanadeviaInova_ProductMarketingManager_Resume.docx
+++ b/applications/KanadeviaInova_ProductMarketingManager/Dorian_Moyne_KanadeviaInova_ProductMarketingManager_Resume.docx
@@ -31,7 +31,7 @@
           <w:sz w:val="22"/>
           <w:szCs w:val="22"/>
         </w:rPr>
-        <w:t xml:space="preserve">Product &amp; Marketing Manager – Energy Transition</w:t>
+        <w:t xml:space="preserve">Product &amp; Marketing Manager, Energy Transition</w:t>
       </w:r>
     </w:p>
     <w:p>
@@ -78,7 +78,7 @@
           <w:sz w:val="22"/>
           <w:szCs w:val="22"/>
         </w:rPr>
-        <w:t xml:space="preserve">10+ years managing industrial products across their full lifecycle — strategy, roadmap, marketing execution, and P&amp;L ownership — in automotive, e-mobility, energy storage (BESS), and industrial electronics. Engineer by training, with direct, hands-on experience serving power and renewable-energy customers (Northvolt, Form Energy, EOS Energy, Tesla Megapack) on custom and standard product solutions. Runs cross-functional product development and go-to-market programs: market and competitive analysis, pricing strategy, sales enablement (webinars, distributor training), and marketing campaigns (newsletters, lead generation) in coordination with corporate marketing, engineering, and sales teams. Tracks KPIs and customer feedback to drive continuous improvement; reports roadmap and strategy trade-offs to executive leadership. Native French, bilingual English, German (learning).</w:t>
+        <w:t xml:space="preserve">10+ years managing industrial products across their full lifecycle in automotive, e-mobility, energy storage (BESS), and industrial electronics. Responsibilities span strategy, roadmap, marketing execution, and P&amp;L ownership. Engineer by training, with hands-on experience serving power and renewable-energy customers (Northvolt, Form Energy, EOS Energy, Tesla Megapack) on custom and standard product solutions. Runs cross-functional product development and go-to-market programs: market and competitive analysis, pricing strategy, sales enablement (webinars, distributor training), and marketing campaigns (newsletters, lead generation) in coordination with corporate marketing, engineering, and sales teams. Tracks KPIs and customer feedback and adjusts the roadmap accordingly. Reports roadmap and strategy trade-offs to executive leadership. Native French, bilingual English, German (learning).</w:t>
       </w:r>
     </w:p>
     <w:p>
@@ -135,9 +135,6 @@
     </w:p>
     <w:p>
       <w:pPr>
-        <w:tabs>
-          <w:tab w:val="right" w:pos="10224"/>
-        </w:tabs>
         <w:spacing w:after="40" w:before="160"/>
       </w:pPr>
       <w:r>
@@ -167,7 +164,7 @@
           <w:sz w:val="22"/>
           <w:szCs w:val="22"/>
         </w:rPr>
-        <w:t xml:space="preserve">Amphenol – Remote</w:t>
+        <w:t xml:space="preserve">Amphenol, Remote</w:t>
       </w:r>
       <w:r>
         <w:rPr>
@@ -197,7 +194,7 @@
           <w:sz w:val="22"/>
           <w:szCs w:val="22"/>
         </w:rPr>
-        <w:t xml:space="preserve">Building a new EMEA organization from the ground up: defined and executed market entry and growth strategy across product and commercial dimensions, grounded in market and competitive analysis.</w:t>
+        <w:t xml:space="preserve">Built a new EMEA organization from the ground up, defining and executing market entry and growth strategy across product and commercial dimensions, based on market and competitive analysis.</w:t>
       </w:r>
     </w:p>
     <w:p>
@@ -259,9 +256,6 @@
     </w:p>
     <w:p>
       <w:pPr>
-        <w:tabs>
-          <w:tab w:val="right" w:pos="10224"/>
-        </w:tabs>
         <w:spacing w:after="40" w:before="160"/>
       </w:pPr>
       <w:r>
@@ -291,7 +285,7 @@
           <w:sz w:val="22"/>
           <w:szCs w:val="22"/>
         </w:rPr>
-        <w:t xml:space="preserve">Amphenol – Remote</w:t>
+        <w:t xml:space="preserve">Amphenol, Remote</w:t>
       </w:r>
       <w:r>
         <w:rPr>
@@ -340,7 +334,7 @@
           <w:sz w:val="22"/>
           <w:szCs w:val="22"/>
         </w:rPr>
-        <w:t xml:space="preserve">Direct technical and commercial point of contact for tier-1 battery energy storage system (BESS) OEMs — including Northvolt, Form Energy, EOS Energy, and Tesla Megapack — proposing standard and custom connector solutions for daisy-chain and inverter applications.</w:t>
+        <w:t xml:space="preserve">Direct technical and commercial point of contact for tier-1 battery energy storage system (BESS) OEMs, including Northvolt, Form Energy, EOS Energy, and Tesla Megapack, proposing standard and custom connector solutions for daisy-chain and inverter applications.</w:t>
       </w:r>
     </w:p>
     <w:p>
@@ -402,9 +396,6 @@
     </w:p>
     <w:p>
       <w:pPr>
-        <w:tabs>
-          <w:tab w:val="right" w:pos="10224"/>
-        </w:tabs>
         <w:spacing w:after="40" w:before="160"/>
       </w:pPr>
       <w:r>
@@ -416,7 +407,7 @@
           <w:sz w:val="22"/>
           <w:szCs w:val="22"/>
         </w:rPr>
-        <w:t xml:space="preserve">Product Manager – Automotive Connector</w:t>
+        <w:t xml:space="preserve">Product Manager, Automotive Connector</w:t>
       </w:r>
     </w:p>
     <w:p>
@@ -434,7 +425,7 @@
           <w:sz w:val="22"/>
           <w:szCs w:val="22"/>
         </w:rPr>
-        <w:t xml:space="preserve">Amphenol – Besançon, France</w:t>
+        <w:t xml:space="preserve">Amphenol, Besançon, France</w:t>
       </w:r>
       <w:r>
         <w:rPr>
@@ -507,9 +498,6 @@
     </w:p>
     <w:p>
       <w:pPr>
-        <w:tabs>
-          <w:tab w:val="right" w:pos="10224"/>
-        </w:tabs>
         <w:spacing w:after="40" w:before="160"/>
       </w:pPr>
       <w:r>
@@ -521,7 +509,7 @@
           <w:sz w:val="22"/>
           <w:szCs w:val="22"/>
         </w:rPr>
-        <w:t xml:space="preserve">Product Manager – Miniature Industrial Connector</w:t>
+        <w:t xml:space="preserve">Product Manager, Miniature Industrial Connector</w:t>
       </w:r>
     </w:p>
     <w:p>
@@ -539,7 +527,7 @@
           <w:sz w:val="22"/>
           <w:szCs w:val="22"/>
         </w:rPr>
-        <w:t xml:space="preserve">Amphenol – Besançon, France</w:t>
+        <w:t xml:space="preserve">Amphenol, Besançon, France</w:t>
       </w:r>
       <w:r>
         <w:rPr>
@@ -574,9 +562,6 @@
     </w:p>
     <w:p>
       <w:pPr>
-        <w:tabs>
-          <w:tab w:val="right" w:pos="10224"/>
-        </w:tabs>
         <w:spacing w:after="40" w:before="160"/>
       </w:pPr>
       <w:r>
@@ -606,7 +591,7 @@
           <w:sz w:val="22"/>
           <w:szCs w:val="22"/>
         </w:rPr>
-        <w:t xml:space="preserve">C&amp;K – Dole, France</w:t>
+        <w:t xml:space="preserve">C&amp;K, Dole, France</w:t>
       </w:r>
       <w:r>
         <w:rPr>

</xml_diff>

<commit_message>
Anonymize named BESS clients on resume over confidentiality concern
User flagged possible NDA/confidentiality restriction on naming
Amphenol's named accounts. Replaced "Northvolt, Form Energy, EOS
Energy, Tesla Megapack" with "several leading tier-1 BESS OEMs" in
the resume (summary + Group Product Manager bullet) and regenerated
docx/pdf. Kept the named accounts in the report as private interview
notes only, with a flag to verify the contract before naming them
out loud.

Co-Authored-By: Claude Sonnet 5 <noreply@anthropic.com>
Claude-Session: https://claude.ai/code/session_01HvzpZWt1KfeTxdgbzsHSvq
</commit_message>
<xml_diff>
--- a/applications/KanadeviaInova_ProductMarketingManager/Dorian_Moyne_KanadeviaInova_ProductMarketingManager_Resume.docx
+++ b/applications/KanadeviaInova_ProductMarketingManager/Dorian_Moyne_KanadeviaInova_ProductMarketingManager_Resume.docx
@@ -78,7 +78,7 @@
           <w:sz w:val="22"/>
           <w:szCs w:val="22"/>
         </w:rPr>
-        <w:t xml:space="preserve">10+ years managing industrial products across their full lifecycle in automotive, e-mobility, energy storage (BESS), and industrial electronics. Responsibilities span strategy, roadmap, marketing execution, and P&amp;L ownership. Engineer by training, with hands-on experience serving power and renewable-energy customers (Northvolt, Form Energy, EOS Energy, Tesla Megapack) on custom and standard product solutions. Runs cross-functional product development and go-to-market programs: market and competitive analysis, pricing strategy, sales enablement (webinars, distributor training), and marketing campaigns (newsletters, lead generation) in coordination with corporate marketing, engineering, and sales teams. Tracks KPIs and customer feedback and adjusts the roadmap accordingly. Reports roadmap and strategy trade-offs to executive leadership. Native French, bilingual English, German (learning).</w:t>
+        <w:t xml:space="preserve">10+ years managing industrial products across their full lifecycle in automotive, e-mobility, energy storage (BESS), and industrial electronics. Responsibilities span strategy, roadmap, marketing execution, and P&amp;L ownership. Engineer by training, with hands-on experience serving leading battery energy storage system (BESS) OEMs on custom and standard product solutions. Runs cross-functional product development and go-to-market programs: market and competitive analysis, pricing strategy, sales enablement (webinars, distributor training), and marketing campaigns (newsletters, lead generation) in coordination with corporate marketing, engineering, and sales teams. Tracks KPIs and customer feedback and adjusts the roadmap accordingly. Reports roadmap and strategy trade-offs to executive leadership. Native French, bilingual English, German (learning).</w:t>
       </w:r>
     </w:p>
     <w:p>
@@ -334,7 +334,7 @@
           <w:sz w:val="22"/>
           <w:szCs w:val="22"/>
         </w:rPr>
-        <w:t xml:space="preserve">Direct technical and commercial point of contact for tier-1 battery energy storage system (BESS) OEMs, including Northvolt, Form Energy, EOS Energy, and Tesla Megapack, proposing standard and custom connector solutions for daisy-chain and inverter applications.</w:t>
+        <w:t xml:space="preserve">Direct technical and commercial point of contact for several leading tier-1 battery energy storage system (BESS) OEMs, proposing standard and custom connector solutions for daisy-chain and inverter applications.</w:t>
       </w:r>
     </w:p>
     <w:p>

</xml_diff>